<commit_message>
Escalation matrix: FATF date 19 June 2026, R02 pointer to latest version
</commit_message>
<xml_diff>
--- a/docs/procedures/SOP-ESC-01_Escalation_Matrix_v1.0.docx
+++ b/docs/procedures/SOP-ESC-01_Escalation_Matrix_v1.0.docx
@@ -1683,7 +1683,7 @@
                 <w:sz w:val="16"/>
                 <w:szCs w:val="16"/>
               </w:rPr>
-              <w:t xml:space="preserve">See SOP-R02-01 v1.0</w:t>
+              <w:t xml:space="preserve">See SOP-R02-01 (latest version)</w:t>
             </w:r>
           </w:p>
         </w:tc>
@@ -2626,7 +2626,7 @@
                 <w:sz w:val="16"/>
                 <w:szCs w:val="16"/>
               </w:rPr>
-              <w:t xml:space="preserve">Legal or headquarters country is on the FATF lists (as of 9 June 2026)</w:t>
+              <w:t xml:space="preserve">Legal or headquarters country is on the FATF lists (as of 19 June 2026)</w:t>
             </w:r>
           </w:p>
         </w:tc>

</xml_diff>